<commit_message>
feat(cad): video Modul 7 versi klik GUI (braket flens dengan Link boss)
- Rekaman klik GUI asli 11:46:
  - Body Flens: cakram Ø90 x 10, lubang pusat Ø26, lubang baut Ø7 (Coincident ke sumbu X, jarak 29) lalu Polar Pattern Base Z x 6
  - Body Boss Ø14 x 10 dengan Placement berekspresi 29*cos/sin(30); dua Link lewat Link Actions -> Make Link (150° dan 270°)
  - uji satu sumber: diameter boss 14 -> 18 -> 14, ketiga boss ikut berubah
  - Part Braket diputar 90° terhadap X; Union 60.617,03 mm³; Intersection Boss-Flens 0; jarak pusat boss 50,23; massa baja 475,84 g
- Teks langkah 1-7 disesuaikan dengan video (FreeCAD 1.1: Point On Object lewat Coincident Constraint).

Co-Authored-By: Claude Opus 5.5 <noreply@anthropic.com>
</commit_message>
<xml_diff>
--- a/Pemodelan-Computer-Aided-Design/Modul-Word/Modul-7-Proyek-Gabungan-2D-dan-3D-Blok-dan-Sub-Assembly.docx
+++ b/Pemodelan-Computer-Aided-Design/Modul-Word/Modul-7-Proyek-Gabungan-2D-dan-3D-Blok-dan-Sub-Assembly.docx
@@ -11901,7 +11901,25 @@
           <w:i w:val="0"/>
           <w:sz w:val="22"/>
         </w:rPr>
-        <w:t>Tulis daftar fitur: cakram, lubang pusat, pola lubang baut, boss ×3, rakitan. Part Design → Create body “Flens” → Sketch XY lingkaran ⌀90 berpusat di origin (konstrain Coincident + Diameter) → Pad 10 mm.</w:t>
+        <w:t xml:space="preserve">Tulis daftar fitur: cakram, lubang pusat, pola lubang baut, boss ×3, rakitan. File → New Document; Part Design → New Body, tekan F2 dan ganti nama “Flens”. Sketch → New Sketch → XY-plane: </w:t>
+      </w:r>
+      <w:r>
+        <w:rPr>
+          <w:rFonts w:ascii="Arial" w:hAnsi="Arial" w:eastAsia="Arial" w:cs="Arial"/>
+          <w:b/>
+          <w:i w:val="0"/>
+          <w:sz w:val="22"/>
+        </w:rPr>
+        <w:t>Circle From Center</w:t>
+      </w:r>
+      <w:r>
+        <w:rPr>
+          <w:rFonts w:ascii="Arial" w:hAnsi="Arial" w:eastAsia="Arial" w:cs="Arial"/>
+          <w:b w:val="0"/>
+          <w:i w:val="0"/>
+          <w:sz w:val="22"/>
+        </w:rPr>
+        <w:t xml:space="preserve"> dengan klik pertama tepat di titik asal (Coincident otomatis) → Diameter Dimension 90 → Fully constrained → Close. Pad 10 mm. Python console: round(App.ActiveDocument.getObjectsByLabel('Flens')[0].Shape.Volume, 2) → 63.617,25 mm³.</w:t>
       </w:r>
     </w:p>
     <w:p>
@@ -11934,7 +11952,25 @@
           <w:i w:val="0"/>
           <w:sz w:val="22"/>
         </w:rPr>
-        <w:t>Klik muka atas → Create sketch → lingkaran ⌀26 sepusat → Pocket Through all. Baca Body.Shape.Volume dan bandingkan dengan (π/4)(D² − d₀²)·h.</w:t>
+        <w:t xml:space="preserve">Tekan 0, klik muka atas cakram → Sketch → New Sketch: sketsa langsung menempel di muka itu. Lingkaran dari titik asal → Diameter 26 → Close → Pocket, Type </w:t>
+      </w:r>
+      <w:r>
+        <w:rPr>
+          <w:rFonts w:ascii="Arial" w:hAnsi="Arial" w:eastAsia="Arial" w:cs="Arial"/>
+          <w:b w:val="0"/>
+          <w:i/>
+          <w:sz w:val="22"/>
+        </w:rPr>
+        <w:t>Through all</w:t>
+      </w:r>
+      <w:r>
+        <w:rPr>
+          <w:rFonts w:ascii="Arial" w:hAnsi="Arial" w:eastAsia="Arial" w:cs="Arial"/>
+          <w:b w:val="0"/>
+          <w:i w:val="0"/>
+          <w:sz w:val="22"/>
+        </w:rPr>
+        <w:t>. Volume 58.307,96 mm³ = (π/4)(D² − d₀²)·h.</w:t>
       </w:r>
     </w:p>
     <w:p>
@@ -11967,7 +12003,61 @@
           <w:i w:val="0"/>
           <w:sz w:val="22"/>
         </w:rPr>
-        <w:t>Sketch di muka atas: satu lingkaran ⌀7 berpusat di (29, 0) (konstrain Distance dari origin + Point on horizontal axis) → Pocket Through all → PolarPattern: Axis Base Z, Angle 360°, Occurrences 6. Cocokkan volume dengan Persamaan (2) = 55.998,9 mm³.</w:t>
+        <w:t xml:space="preserve">Sketsa baru di muka atas: satu lingkaran → Diameter 7; pilih pusatnya dan sumbu X sketsa → </w:t>
+      </w:r>
+      <w:r>
+        <w:rPr>
+          <w:rFonts w:ascii="Arial" w:hAnsi="Arial" w:eastAsia="Arial" w:cs="Arial"/>
+          <w:b/>
+          <w:i w:val="0"/>
+          <w:sz w:val="22"/>
+        </w:rPr>
+        <w:t>Coincident Constraint</w:t>
+      </w:r>
+      <w:r>
+        <w:rPr>
+          <w:rFonts w:ascii="Arial" w:hAnsi="Arial" w:eastAsia="Arial" w:cs="Arial"/>
+          <w:b w:val="0"/>
+          <w:i w:val="0"/>
+          <w:sz w:val="22"/>
+        </w:rPr>
+        <w:t xml:space="preserve"> (di FreeCAD 1.1 perintah ini juga menaruh titik pada garis); pusat → Horizontal Dimension 29 → Fully constrained. Pocket Through all (57.923,11 mm³). Pilih Pocket001 → Part Design → Transformation Features → </w:t>
+      </w:r>
+      <w:r>
+        <w:rPr>
+          <w:rFonts w:ascii="Arial" w:hAnsi="Arial" w:eastAsia="Arial" w:cs="Arial"/>
+          <w:b/>
+          <w:i w:val="0"/>
+          <w:sz w:val="22"/>
+        </w:rPr>
+        <w:t>Polar Pattern</w:t>
+      </w:r>
+      <w:r>
+        <w:rPr>
+          <w:rFonts w:ascii="Arial" w:hAnsi="Arial" w:eastAsia="Arial" w:cs="Arial"/>
+          <w:b w:val="0"/>
+          <w:i w:val="0"/>
+          <w:sz w:val="22"/>
+        </w:rPr>
+        <w:t xml:space="preserve">: Axis </w:t>
+      </w:r>
+      <w:r>
+        <w:rPr>
+          <w:rFonts w:ascii="Arial" w:hAnsi="Arial" w:eastAsia="Arial" w:cs="Arial"/>
+          <w:b w:val="0"/>
+          <w:i/>
+          <w:sz w:val="22"/>
+        </w:rPr>
+        <w:t>Base Z-axis</w:t>
+      </w:r>
+      <w:r>
+        <w:rPr>
+          <w:rFonts w:ascii="Arial" w:hAnsi="Arial" w:eastAsia="Arial" w:cs="Arial"/>
+          <w:b w:val="0"/>
+          <w:i w:val="0"/>
+          <w:sz w:val="22"/>
+        </w:rPr>
+        <w:t>, Angle 360°, Occurrences 6 → OK. Volume 55.998,89 mm³ sama dengan Persamaan (2).</w:t>
       </w:r>
     </w:p>
     <w:p>
@@ -12000,7 +12090,7 @@
           <w:i w:val="0"/>
           <w:sz w:val="22"/>
         </w:rPr>
-        <w:t>Create body “Boss” → Sketch XY lingkaran ⌀14 di origin → Pad 10. Atur Placement Body Boss ke (0, 0, 10) lalu geser ke sudut 30° pada lingkaran baut: Base = (D</w:t>
+        <w:t>Part Design → New Body, ganti nama “Boss” → Sketch → New Sketch → XY-plane001 → lingkaran di titik asal → Diameter 14 → Pad 10. Pilih Boss → Data → Placement → Position: pada x ketik = (editor ekspresi terbuka) lalu 29 * cos(30), pada y =29 * sin(30), z 10. Boss duduk di atas flens pada sudut 30° lingkaran baut (D</w:t>
       </w:r>
       <w:r>
         <w:rPr>
@@ -12019,26 +12109,7 @@
           <w:i w:val="0"/>
           <w:sz w:val="22"/>
         </w:rPr>
-        <w:t>/2·cos 30°, D</w:t>
-      </w:r>
-      <w:r>
-        <w:rPr>
-          <w:rFonts w:ascii="Arial" w:hAnsi="Arial" w:eastAsia="Arial" w:cs="Arial"/>
-          <w:b w:val="0"/>
-          <w:i w:val="0"/>
-          <w:sz w:val="22"/>
-          <w:vertAlign w:val="subscript"/>
-        </w:rPr>
-        <w:t>bc</w:t>
-      </w:r>
-      <w:r>
-        <w:rPr>
-          <w:rFonts w:ascii="Arial" w:hAnsi="Arial" w:eastAsia="Arial" w:cs="Arial"/>
-          <w:b w:val="0"/>
-          <w:i w:val="0"/>
-          <w:sz w:val="22"/>
-        </w:rPr>
-        <w:t>/2·sin 30°, 10) dengan ekspresi.</w:t>
+        <w:t>/2 = 29).</w:t>
       </w:r>
     </w:p>
     <w:p>
@@ -12071,7 +12142,25 @@
           <w:i w:val="0"/>
           <w:sz w:val="22"/>
         </w:rPr>
-        <w:t>Pilih Body Boss → Std LinkMake dua kali; beri Placement pada sudut 150° dan 270° (ekspresi cos/sin) sehingga tiga boss berselang-seling dengan enam lubang baut. Ubah diameter sketsa boss → ketiga boss ikut berubah.</w:t>
+        <w:t xml:space="preserve">Pilih Boss → toolbar </w:t>
+      </w:r>
+      <w:r>
+        <w:rPr>
+          <w:rFonts w:ascii="Arial" w:hAnsi="Arial" w:eastAsia="Arial" w:cs="Arial"/>
+          <w:b/>
+          <w:i w:val="0"/>
+          <w:sz w:val="22"/>
+        </w:rPr>
+        <w:t>Link Actions → Make Link</w:t>
+      </w:r>
+      <w:r>
+        <w:rPr>
+          <w:rFonts w:ascii="Arial" w:hAnsi="Arial" w:eastAsia="Arial" w:cs="Arial"/>
+          <w:b w:val="0"/>
+          <w:i w:val="0"/>
+          <w:sz w:val="22"/>
+        </w:rPr>
+        <w:t>: muncul Boss001. Position Boss001: x =29 * cos(150), y =29 * sin(150), z 10. Ulangi untuk Boss002 dengan 270°. Uji satu sumber: klik ganda Sketch003 → klik ganda Constraint2 (14 mm) → 18 → Close: ketiga boss ikut membesar; kembalikan ke 14.</w:t>
       </w:r>
     </w:p>
     <w:p>
@@ -12104,7 +12193,43 @@
           <w:i w:val="0"/>
           <w:sz w:val="22"/>
         </w:rPr>
-        <w:t>Std Part “Braket” → seret Flens, Boss, dan dua Link ke dalamnya. Ubah Placement Part: Rotation Axis (1,0,0) Angle 90° sehingga flens berdiri tegak. Part → Boolean → Union (Flens + Boss + Link) → volume total = flens + 3 × boss.</w:t>
+        <w:t xml:space="preserve">Ciutkan Flens dan Boss di pohon. Toolbar </w:t>
+      </w:r>
+      <w:r>
+        <w:rPr>
+          <w:rFonts w:ascii="Arial" w:hAnsi="Arial" w:eastAsia="Arial" w:cs="Arial"/>
+          <w:b/>
+          <w:i w:val="0"/>
+          <w:sz w:val="22"/>
+        </w:rPr>
+        <w:t>Create part</w:t>
+      </w:r>
+      <w:r>
+        <w:rPr>
+          <w:rFonts w:ascii="Arial" w:hAnsi="Arial" w:eastAsia="Arial" w:cs="Arial"/>
+          <w:b w:val="0"/>
+          <w:i w:val="0"/>
+          <w:sz w:val="22"/>
+        </w:rPr>
+        <w:t xml:space="preserve"> → ganti nama “Braket”; pilih Flens, Boss, Boss001, Boss002 lalu seret ke Braket. Placement Braket: Axis x 1, z 0, Angle 90° → flens berdiri tegak. Workbench Part: pilih keempatnya → Part → Boolean → </w:t>
+      </w:r>
+      <w:r>
+        <w:rPr>
+          <w:rFonts w:ascii="Arial" w:hAnsi="Arial" w:eastAsia="Arial" w:cs="Arial"/>
+          <w:b/>
+          <w:i w:val="0"/>
+          <w:sz w:val="22"/>
+        </w:rPr>
+        <w:t>Union</w:t>
+      </w:r>
+      <w:r>
+        <w:rPr>
+          <w:rFonts w:ascii="Arial" w:hAnsi="Arial" w:eastAsia="Arial" w:cs="Arial"/>
+          <w:b w:val="0"/>
+          <w:i w:val="0"/>
+          <w:sz w:val="22"/>
+        </w:rPr>
+        <w:t>. round(App.ActiveDocument.Fusion.Shape.Volume, 2) → 60.617,03 mm³ = 55.998,89 + 3 × 1.539,38.</w:t>
       </w:r>
     </w:p>
     <w:p>
@@ -12137,7 +12262,25 @@
           <w:i w:val="0"/>
           <w:sz w:val="22"/>
         </w:rPr>
-        <w:t>Boolean Common Boss–Flens harus kosong (tidak menembus); Std Measure Distance antar boss = D</w:t>
+        <w:t xml:space="preserve">Pilih Flens dan Boss → Part → Boolean → </w:t>
+      </w:r>
+      <w:r>
+        <w:rPr>
+          <w:rFonts w:ascii="Arial" w:hAnsi="Arial" w:eastAsia="Arial" w:cs="Arial"/>
+          <w:b/>
+          <w:i w:val="0"/>
+          <w:sz w:val="22"/>
+        </w:rPr>
+        <w:t>Intersection</w:t>
+      </w:r>
+      <w:r>
+        <w:rPr>
+          <w:rFonts w:ascii="Arial" w:hAnsi="Arial" w:eastAsia="Arial" w:cs="Arial"/>
+          <w:b w:val="0"/>
+          <w:i w:val="0"/>
+          <w:sz w:val="22"/>
+        </w:rPr>
+        <w:t>: volume Common 0 (boss tidak menembus flens). Jarak pusat dua boss: round((App.ActiveDocument.Link.Placement.Base - App.ActiveDocument.Body001.Placement.Base).Length, 2) → 50,23 = D</w:t>
       </w:r>
       <w:r>
         <w:rPr>
@@ -12156,7 +12299,7 @@
           <w:i w:val="0"/>
           <w:sz w:val="22"/>
         </w:rPr>
-        <w:t>·sin 60°. Hitung massa baja (ρ = 7,85 g/cm³) dari Fusion.Shape.Volume/1000; Ctrl+S → Latihan7_NIM.FCStd.</w:t>
+        <w:t>·sin 60°. Massa baja round(App.ActiveDocument.Fusion.Shape.Volume * 7.85 / 1000, 2) → 475,84 g; Ctrl+S → Latihan7_NIM.FCStd.</w:t>
       </w:r>
     </w:p>
     <w:p>

</xml_diff>

<commit_message>
feat(cad): video Modul 7 versi klik GUI (braket flens dengan Link boss) (#1042)
- Rekaman klik GUI asli 11:46:
  - Body Flens: cakram Ø90 x 10, lubang pusat Ø26, lubang baut Ø7 (Coincident ke sumbu X, jarak 29) lalu Polar Pattern Base Z x 6
  - Body Boss Ø14 x 10 dengan Placement berekspresi 29*cos/sin(30); dua Link lewat Link Actions -> Make Link (150° dan 270°)
  - uji satu sumber: diameter boss 14 -> 18 -> 14, ketiga boss ikut berubah
  - Part Braket diputar 90° terhadap X; Union 60.617,03 mm³; Intersection Boss-Flens 0; jarak pusat boss 50,23; massa baja 475,84 g
- Teks langkah 1-7 disesuaikan dengan video (FreeCAD 1.1: Point On Object lewat Coincident Constraint).

Co-authored-by: Claude Opus 5.5 <noreply@anthropic.com>
</commit_message>
<xml_diff>
--- a/Pemodelan-Computer-Aided-Design/Modul-Word/Modul-7-Proyek-Gabungan-2D-dan-3D-Blok-dan-Sub-Assembly.docx
+++ b/Pemodelan-Computer-Aided-Design/Modul-Word/Modul-7-Proyek-Gabungan-2D-dan-3D-Blok-dan-Sub-Assembly.docx
@@ -11901,7 +11901,25 @@
           <w:i w:val="0"/>
           <w:sz w:val="22"/>
         </w:rPr>
-        <w:t>Tulis daftar fitur: cakram, lubang pusat, pola lubang baut, boss ×3, rakitan. Part Design → Create body “Flens” → Sketch XY lingkaran ⌀90 berpusat di origin (konstrain Coincident + Diameter) → Pad 10 mm.</w:t>
+        <w:t xml:space="preserve">Tulis daftar fitur: cakram, lubang pusat, pola lubang baut, boss ×3, rakitan. File → New Document; Part Design → New Body, tekan F2 dan ganti nama “Flens”. Sketch → New Sketch → XY-plane: </w:t>
+      </w:r>
+      <w:r>
+        <w:rPr>
+          <w:rFonts w:ascii="Arial" w:hAnsi="Arial" w:eastAsia="Arial" w:cs="Arial"/>
+          <w:b/>
+          <w:i w:val="0"/>
+          <w:sz w:val="22"/>
+        </w:rPr>
+        <w:t>Circle From Center</w:t>
+      </w:r>
+      <w:r>
+        <w:rPr>
+          <w:rFonts w:ascii="Arial" w:hAnsi="Arial" w:eastAsia="Arial" w:cs="Arial"/>
+          <w:b w:val="0"/>
+          <w:i w:val="0"/>
+          <w:sz w:val="22"/>
+        </w:rPr>
+        <w:t xml:space="preserve"> dengan klik pertama tepat di titik asal (Coincident otomatis) → Diameter Dimension 90 → Fully constrained → Close. Pad 10 mm. Python console: round(App.ActiveDocument.getObjectsByLabel('Flens')[0].Shape.Volume, 2) → 63.617,25 mm³.</w:t>
       </w:r>
     </w:p>
     <w:p>
@@ -11934,7 +11952,25 @@
           <w:i w:val="0"/>
           <w:sz w:val="22"/>
         </w:rPr>
-        <w:t>Klik muka atas → Create sketch → lingkaran ⌀26 sepusat → Pocket Through all. Baca Body.Shape.Volume dan bandingkan dengan (π/4)(D² − d₀²)·h.</w:t>
+        <w:t xml:space="preserve">Tekan 0, klik muka atas cakram → Sketch → New Sketch: sketsa langsung menempel di muka itu. Lingkaran dari titik asal → Diameter 26 → Close → Pocket, Type </w:t>
+      </w:r>
+      <w:r>
+        <w:rPr>
+          <w:rFonts w:ascii="Arial" w:hAnsi="Arial" w:eastAsia="Arial" w:cs="Arial"/>
+          <w:b w:val="0"/>
+          <w:i/>
+          <w:sz w:val="22"/>
+        </w:rPr>
+        <w:t>Through all</w:t>
+      </w:r>
+      <w:r>
+        <w:rPr>
+          <w:rFonts w:ascii="Arial" w:hAnsi="Arial" w:eastAsia="Arial" w:cs="Arial"/>
+          <w:b w:val="0"/>
+          <w:i w:val="0"/>
+          <w:sz w:val="22"/>
+        </w:rPr>
+        <w:t>. Volume 58.307,96 mm³ = (π/4)(D² − d₀²)·h.</w:t>
       </w:r>
     </w:p>
     <w:p>
@@ -11967,7 +12003,61 @@
           <w:i w:val="0"/>
           <w:sz w:val="22"/>
         </w:rPr>
-        <w:t>Sketch di muka atas: satu lingkaran ⌀7 berpusat di (29, 0) (konstrain Distance dari origin + Point on horizontal axis) → Pocket Through all → PolarPattern: Axis Base Z, Angle 360°, Occurrences 6. Cocokkan volume dengan Persamaan (2) = 55.998,9 mm³.</w:t>
+        <w:t xml:space="preserve">Sketsa baru di muka atas: satu lingkaran → Diameter 7; pilih pusatnya dan sumbu X sketsa → </w:t>
+      </w:r>
+      <w:r>
+        <w:rPr>
+          <w:rFonts w:ascii="Arial" w:hAnsi="Arial" w:eastAsia="Arial" w:cs="Arial"/>
+          <w:b/>
+          <w:i w:val="0"/>
+          <w:sz w:val="22"/>
+        </w:rPr>
+        <w:t>Coincident Constraint</w:t>
+      </w:r>
+      <w:r>
+        <w:rPr>
+          <w:rFonts w:ascii="Arial" w:hAnsi="Arial" w:eastAsia="Arial" w:cs="Arial"/>
+          <w:b w:val="0"/>
+          <w:i w:val="0"/>
+          <w:sz w:val="22"/>
+        </w:rPr>
+        <w:t xml:space="preserve"> (di FreeCAD 1.1 perintah ini juga menaruh titik pada garis); pusat → Horizontal Dimension 29 → Fully constrained. Pocket Through all (57.923,11 mm³). Pilih Pocket001 → Part Design → Transformation Features → </w:t>
+      </w:r>
+      <w:r>
+        <w:rPr>
+          <w:rFonts w:ascii="Arial" w:hAnsi="Arial" w:eastAsia="Arial" w:cs="Arial"/>
+          <w:b/>
+          <w:i w:val="0"/>
+          <w:sz w:val="22"/>
+        </w:rPr>
+        <w:t>Polar Pattern</w:t>
+      </w:r>
+      <w:r>
+        <w:rPr>
+          <w:rFonts w:ascii="Arial" w:hAnsi="Arial" w:eastAsia="Arial" w:cs="Arial"/>
+          <w:b w:val="0"/>
+          <w:i w:val="0"/>
+          <w:sz w:val="22"/>
+        </w:rPr>
+        <w:t xml:space="preserve">: Axis </w:t>
+      </w:r>
+      <w:r>
+        <w:rPr>
+          <w:rFonts w:ascii="Arial" w:hAnsi="Arial" w:eastAsia="Arial" w:cs="Arial"/>
+          <w:b w:val="0"/>
+          <w:i/>
+          <w:sz w:val="22"/>
+        </w:rPr>
+        <w:t>Base Z-axis</w:t>
+      </w:r>
+      <w:r>
+        <w:rPr>
+          <w:rFonts w:ascii="Arial" w:hAnsi="Arial" w:eastAsia="Arial" w:cs="Arial"/>
+          <w:b w:val="0"/>
+          <w:i w:val="0"/>
+          <w:sz w:val="22"/>
+        </w:rPr>
+        <w:t>, Angle 360°, Occurrences 6 → OK. Volume 55.998,89 mm³ sama dengan Persamaan (2).</w:t>
       </w:r>
     </w:p>
     <w:p>
@@ -12000,7 +12090,7 @@
           <w:i w:val="0"/>
           <w:sz w:val="22"/>
         </w:rPr>
-        <w:t>Create body “Boss” → Sketch XY lingkaran ⌀14 di origin → Pad 10. Atur Placement Body Boss ke (0, 0, 10) lalu geser ke sudut 30° pada lingkaran baut: Base = (D</w:t>
+        <w:t>Part Design → New Body, ganti nama “Boss” → Sketch → New Sketch → XY-plane001 → lingkaran di titik asal → Diameter 14 → Pad 10. Pilih Boss → Data → Placement → Position: pada x ketik = (editor ekspresi terbuka) lalu 29 * cos(30), pada y =29 * sin(30), z 10. Boss duduk di atas flens pada sudut 30° lingkaran baut (D</w:t>
       </w:r>
       <w:r>
         <w:rPr>
@@ -12019,26 +12109,7 @@
           <w:i w:val="0"/>
           <w:sz w:val="22"/>
         </w:rPr>
-        <w:t>/2·cos 30°, D</w:t>
-      </w:r>
-      <w:r>
-        <w:rPr>
-          <w:rFonts w:ascii="Arial" w:hAnsi="Arial" w:eastAsia="Arial" w:cs="Arial"/>
-          <w:b w:val="0"/>
-          <w:i w:val="0"/>
-          <w:sz w:val="22"/>
-          <w:vertAlign w:val="subscript"/>
-        </w:rPr>
-        <w:t>bc</w:t>
-      </w:r>
-      <w:r>
-        <w:rPr>
-          <w:rFonts w:ascii="Arial" w:hAnsi="Arial" w:eastAsia="Arial" w:cs="Arial"/>
-          <w:b w:val="0"/>
-          <w:i w:val="0"/>
-          <w:sz w:val="22"/>
-        </w:rPr>
-        <w:t>/2·sin 30°, 10) dengan ekspresi.</w:t>
+        <w:t>/2 = 29).</w:t>
       </w:r>
     </w:p>
     <w:p>
@@ -12071,7 +12142,25 @@
           <w:i w:val="0"/>
           <w:sz w:val="22"/>
         </w:rPr>
-        <w:t>Pilih Body Boss → Std LinkMake dua kali; beri Placement pada sudut 150° dan 270° (ekspresi cos/sin) sehingga tiga boss berselang-seling dengan enam lubang baut. Ubah diameter sketsa boss → ketiga boss ikut berubah.</w:t>
+        <w:t xml:space="preserve">Pilih Boss → toolbar </w:t>
+      </w:r>
+      <w:r>
+        <w:rPr>
+          <w:rFonts w:ascii="Arial" w:hAnsi="Arial" w:eastAsia="Arial" w:cs="Arial"/>
+          <w:b/>
+          <w:i w:val="0"/>
+          <w:sz w:val="22"/>
+        </w:rPr>
+        <w:t>Link Actions → Make Link</w:t>
+      </w:r>
+      <w:r>
+        <w:rPr>
+          <w:rFonts w:ascii="Arial" w:hAnsi="Arial" w:eastAsia="Arial" w:cs="Arial"/>
+          <w:b w:val="0"/>
+          <w:i w:val="0"/>
+          <w:sz w:val="22"/>
+        </w:rPr>
+        <w:t>: muncul Boss001. Position Boss001: x =29 * cos(150), y =29 * sin(150), z 10. Ulangi untuk Boss002 dengan 270°. Uji satu sumber: klik ganda Sketch003 → klik ganda Constraint2 (14 mm) → 18 → Close: ketiga boss ikut membesar; kembalikan ke 14.</w:t>
       </w:r>
     </w:p>
     <w:p>
@@ -12104,7 +12193,43 @@
           <w:i w:val="0"/>
           <w:sz w:val="22"/>
         </w:rPr>
-        <w:t>Std Part “Braket” → seret Flens, Boss, dan dua Link ke dalamnya. Ubah Placement Part: Rotation Axis (1,0,0) Angle 90° sehingga flens berdiri tegak. Part → Boolean → Union (Flens + Boss + Link) → volume total = flens + 3 × boss.</w:t>
+        <w:t xml:space="preserve">Ciutkan Flens dan Boss di pohon. Toolbar </w:t>
+      </w:r>
+      <w:r>
+        <w:rPr>
+          <w:rFonts w:ascii="Arial" w:hAnsi="Arial" w:eastAsia="Arial" w:cs="Arial"/>
+          <w:b/>
+          <w:i w:val="0"/>
+          <w:sz w:val="22"/>
+        </w:rPr>
+        <w:t>Create part</w:t>
+      </w:r>
+      <w:r>
+        <w:rPr>
+          <w:rFonts w:ascii="Arial" w:hAnsi="Arial" w:eastAsia="Arial" w:cs="Arial"/>
+          <w:b w:val="0"/>
+          <w:i w:val="0"/>
+          <w:sz w:val="22"/>
+        </w:rPr>
+        <w:t xml:space="preserve"> → ganti nama “Braket”; pilih Flens, Boss, Boss001, Boss002 lalu seret ke Braket. Placement Braket: Axis x 1, z 0, Angle 90° → flens berdiri tegak. Workbench Part: pilih keempatnya → Part → Boolean → </w:t>
+      </w:r>
+      <w:r>
+        <w:rPr>
+          <w:rFonts w:ascii="Arial" w:hAnsi="Arial" w:eastAsia="Arial" w:cs="Arial"/>
+          <w:b/>
+          <w:i w:val="0"/>
+          <w:sz w:val="22"/>
+        </w:rPr>
+        <w:t>Union</w:t>
+      </w:r>
+      <w:r>
+        <w:rPr>
+          <w:rFonts w:ascii="Arial" w:hAnsi="Arial" w:eastAsia="Arial" w:cs="Arial"/>
+          <w:b w:val="0"/>
+          <w:i w:val="0"/>
+          <w:sz w:val="22"/>
+        </w:rPr>
+        <w:t>. round(App.ActiveDocument.Fusion.Shape.Volume, 2) → 60.617,03 mm³ = 55.998,89 + 3 × 1.539,38.</w:t>
       </w:r>
     </w:p>
     <w:p>
@@ -12137,7 +12262,25 @@
           <w:i w:val="0"/>
           <w:sz w:val="22"/>
         </w:rPr>
-        <w:t>Boolean Common Boss–Flens harus kosong (tidak menembus); Std Measure Distance antar boss = D</w:t>
+        <w:t xml:space="preserve">Pilih Flens dan Boss → Part → Boolean → </w:t>
+      </w:r>
+      <w:r>
+        <w:rPr>
+          <w:rFonts w:ascii="Arial" w:hAnsi="Arial" w:eastAsia="Arial" w:cs="Arial"/>
+          <w:b/>
+          <w:i w:val="0"/>
+          <w:sz w:val="22"/>
+        </w:rPr>
+        <w:t>Intersection</w:t>
+      </w:r>
+      <w:r>
+        <w:rPr>
+          <w:rFonts w:ascii="Arial" w:hAnsi="Arial" w:eastAsia="Arial" w:cs="Arial"/>
+          <w:b w:val="0"/>
+          <w:i w:val="0"/>
+          <w:sz w:val="22"/>
+        </w:rPr>
+        <w:t>: volume Common 0 (boss tidak menembus flens). Jarak pusat dua boss: round((App.ActiveDocument.Link.Placement.Base - App.ActiveDocument.Body001.Placement.Base).Length, 2) → 50,23 = D</w:t>
       </w:r>
       <w:r>
         <w:rPr>
@@ -12156,7 +12299,7 @@
           <w:i w:val="0"/>
           <w:sz w:val="22"/>
         </w:rPr>
-        <w:t>·sin 60°. Hitung massa baja (ρ = 7,85 g/cm³) dari Fusion.Shape.Volume/1000; Ctrl+S → Latihan7_NIM.FCStd.</w:t>
+        <w:t>·sin 60°. Massa baja round(App.ActiveDocument.Fusion.Shape.Volume * 7.85 / 1000, 2) → 475,84 g; Ctrl+S → Latihan7_NIM.FCStd.</w:t>
       </w:r>
     </w:p>
     <w:p>

</xml_diff>